<commit_message>
feat: add Starline source registry and deployment assets
</commit_message>
<xml_diff>
--- a/docs/product/starline-mvp-requirements-v0.1.docx
+++ b/docs/product/starline-mvp-requirements-v0.1.docx
@@ -1277,7 +1277,7 @@
                 <w:color w:val="17324D"/>
                 <w:sz w:val="17"/>
               </w:rPr>
-              <w:t>用户可以查询艺人的演出或开票信息。若结果对应多个可能场次，系统应先澄清，不能混合不同场次的信息。</w:t>
+              <w:t>用户查询匹配多个活动或场次时，系统仅追问当前缺失且能区分候选项的信息（如城市、日期或场次），再展示对应候选活动卡片。用户明确确认目标活动前，不进入提醒设置或创建提醒。</w:t>
             </w:r>
           </w:p>
         </w:tc>
@@ -1304,7 +1304,7 @@
                 <w:color w:val="17324D"/>
                 <w:sz w:val="17"/>
               </w:rPr>
-              <w:t>已确认 / 澄清规则建议评审</w:t>
+              <w:t>已确认</w:t>
             </w:r>
           </w:p>
         </w:tc>
@@ -1365,7 +1365,7 @@
                 <w:color w:val="17324D"/>
                 <w:sz w:val="17"/>
               </w:rPr>
-              <w:t>返回信息时提供可核验来源；用户确认来源和活动后，才可继续创建提醒。来源卡片的字段范围待评审。</w:t>
+              <w:t>系统返回信息时提供可核验来源；用户确认来源和活动后，才可继续创建提醒。来源卡片主视图展示艺人/活动、城市/演出日期/场馆、开票时间与状态，以及来源类型/发布方、官方核验状态、最近核验时间和来源链接；发布时间（如可获得）及证据摘要放在展开详情中。未公布字段明确显示“待公布”。</w:t>
             </w:r>
           </w:p>
         </w:tc>
@@ -1393,7 +1393,7 @@
                 <w:color w:val="17324D"/>
                 <w:sz w:val="17"/>
               </w:rPr>
-              <w:t>已确认 / 字段待决</w:t>
+              <w:t>已确认</w:t>
             </w:r>
           </w:p>
         </w:tc>
@@ -1540,7 +1540,7 @@
                 <w:color w:val="17324D"/>
                 <w:sz w:val="17"/>
               </w:rPr>
-              <w:t>用户可为来源已确认且具有明确时间的活动创建提醒。提醒触发时间、通知渠道和时区待评审。</w:t>
+              <w:t>用户可为来源和活动均已确认、且包含明确演出开场时间或开票开始时间的活动创建提醒。用户可选择提前 1 天、1 小时或 10 分钟提醒，可多选，默认提前 1 小时；每个所选提前量各触发一次。通知渠道采用邮箱；首期全站采用中国标准时间 Asia/Shanghai（UTC+8）。</w:t>
             </w:r>
           </w:p>
         </w:tc>
@@ -1557,18 +1557,8 @@
             </w:tcMar>
           </w:tcPr>
           <w:p>
-            <w:pPr>
-              <w:spacing w:after="0" w:before="0" w:line="269" w:lineRule="auto"/>
-            </w:pPr>
-            <w:r/>
             <w:r>
-              <w:rPr>
-                <w:rFonts w:ascii="Microsoft YaHei" w:hAnsi="Microsoft YaHei" w:eastAsia="Microsoft YaHei"/>
-                <w:b w:val="0"/>
-                <w:color w:val="17324D"/>
-                <w:sz w:val="17"/>
-              </w:rPr>
-              <w:t>已确认 / 规则待决</w:t>
+              <w:t>已确认</w:t>
             </w:r>
           </w:p>
         </w:tc>
@@ -1616,18 +1606,8 @@
             </w:tcMar>
           </w:tcPr>
           <w:p>
-            <w:pPr>
-              <w:spacing w:after="0" w:before="0" w:line="269" w:lineRule="auto"/>
-            </w:pPr>
-            <w:r/>
             <w:r>
-              <w:rPr>
-                <w:rFonts w:ascii="Microsoft YaHei" w:hAnsi="Microsoft YaHei" w:eastAsia="Microsoft YaHei"/>
-                <w:b w:val="0"/>
-                <w:color w:val="17324D"/>
-                <w:sz w:val="17"/>
-              </w:rPr>
-              <w:t>用户可取消尚未触发的提醒；取消后不应再次发送该提醒。</w:t>
+              <w:t>用户可取消尚未触发的提醒；取消后，该提醒的所有未发送通知均停止，已发送通知保留记录且不得撤回。同一用户对同一场次和同一提前量只能存在一条有效提醒；重复创建不得产生第二条提醒。活动时间经认可来源核验确认发生变更后，系统须按用户已选提前量重算所有未发送提醒，并邮件告知用户时间变更及新的提醒安排。</w:t>
             </w:r>
           </w:p>
         </w:tc>
@@ -1643,17 +1623,7 @@
             </w:tcMar>
           </w:tcPr>
           <w:p>
-            <w:pPr>
-              <w:spacing w:after="0" w:before="0" w:line="269" w:lineRule="auto"/>
-            </w:pPr>
-            <w:r/>
             <w:r>
-              <w:rPr>
-                <w:rFonts w:ascii="Microsoft YaHei" w:hAnsi="Microsoft YaHei" w:eastAsia="Microsoft YaHei"/>
-                <w:b/>
-                <w:color w:val="28734D"/>
-                <w:sz w:val="17"/>
-              </w:rPr>
               <w:t>已确认</w:t>
             </w:r>
           </w:p>
@@ -1715,7 +1685,7 @@
                 <w:color w:val="17324D"/>
                 <w:sz w:val="17"/>
               </w:rPr>
-              <w:t>区分“信息待公布”和“查询暂时失败”；来源冲突时展示冲突和证据，不静默选择一个结论。</w:t>
+              <w:t>系统区分“信息待公布”“查询暂时失败”“来源冲突”和“来源可能过期”。查询失败时明确提示并提供重试；来源冲突时并列展示各来源和证据，不静默选择结论，在认可的官方来源核验一致前不得基于冲突信息创建提醒；来源过期时显示上次成功官方核验时间并提示刷新，重新核验前不得作为提醒依据。开票时间和活动状态自最近一次成功官方核验起有效 6 小时；演出日期和地点有效 24 小时，达到有效期即标记过期。</w:t>
             </w:r>
           </w:p>
         </w:tc>
@@ -1732,18 +1702,8 @@
             </w:tcMar>
           </w:tcPr>
           <w:p>
-            <w:pPr>
-              <w:spacing w:after="0" w:before="0" w:line="269" w:lineRule="auto"/>
-            </w:pPr>
-            <w:r/>
             <w:r>
-              <w:rPr>
-                <w:rFonts w:ascii="Microsoft YaHei" w:hAnsi="Microsoft YaHei" w:eastAsia="Microsoft YaHei"/>
-                <w:b/>
-                <w:color w:val="9A641A"/>
-                <w:sz w:val="17"/>
-              </w:rPr>
-              <w:t>建议评审</w:t>
+              <w:t>已确认</w:t>
             </w:r>
           </w:p>
         </w:tc>
@@ -1791,18 +1751,8 @@
             </w:tcMar>
           </w:tcPr>
           <w:p>
-            <w:pPr>
-              <w:spacing w:after="0" w:before="0" w:line="269" w:lineRule="auto"/>
-            </w:pPr>
-            <w:r/>
             <w:r>
-              <w:rPr>
-                <w:rFonts w:ascii="Microsoft YaHei" w:hAnsi="Microsoft YaHei" w:eastAsia="Microsoft YaHei"/>
-                <w:b w:val="0"/>
-                <w:color w:val="17324D"/>
-                <w:sz w:val="17"/>
-              </w:rPr>
-              <w:t>不得把未经核实的来源标为官方或已核验；不得编造来源链接、发布时间或活动时间。</w:t>
+              <w:t>仅官方来源清单中已核验的账号/域名可标记为官方并作为核验依据；清单外公开页面只能作为未核实线索展示，不得单独作为提醒依据。不得编造来源链接、发布时间或活动时间。</w:t>
             </w:r>
           </w:p>
         </w:tc>
@@ -1818,18 +1768,8 @@
             </w:tcMar>
           </w:tcPr>
           <w:p>
-            <w:pPr>
-              <w:spacing w:after="0" w:before="0" w:line="269" w:lineRule="auto"/>
-            </w:pPr>
-            <w:r/>
             <w:r>
-              <w:rPr>
-                <w:rFonts w:ascii="Microsoft YaHei" w:hAnsi="Microsoft YaHei" w:eastAsia="Microsoft YaHei"/>
-                <w:b/>
-                <w:color w:val="9A641A"/>
-                <w:sz w:val="17"/>
-              </w:rPr>
-              <w:t>引用初稿</w:t>
+              <w:t>已确认</w:t>
             </w:r>
           </w:p>
         </w:tc>
@@ -1945,7 +1885,7 @@
           <w:color w:val="17324D"/>
           <w:sz w:val="19"/>
         </w:rPr>
-        <w:t>系统展示与来源一致的活动和时间，并提供对应来源及查询时间；不得把其他场次的时间拼接进结果。</w:t>
+        <w:t>系统主卡展示艺人/活动、城市/演出日期/场馆、开票时间与状态，以及来源类型/发布方、官方核验状态、最近核验时间和来源链接；未公布字段显示“待公布”；发布时间（如可获得）及证据摘要放在展开详情中。展示内容须与对应来源一致，不得拼接其他场次的时间。</w:t>
       </w:r>
     </w:p>
     <w:p>
@@ -2119,7 +2059,7 @@
           <w:color w:val="17324D"/>
           <w:sz w:val="19"/>
         </w:rPr>
-        <w:t>系统说明暂时无法查询，不把查询失败伪装成官方“待公布”。提示文案及重试规则待评审。</w:t>
+        <w:t>系统明确提示“查询暂时失败”，不把查询失败伪装成官方“待公布”，并提供重试操作。</w:t>
       </w:r>
     </w:p>
     <w:p>
@@ -2206,7 +2146,7 @@
           <w:color w:val="17324D"/>
           <w:sz w:val="19"/>
         </w:rPr>
-        <w:t>系统先询问城市、日期或场次等澄清信息；用户选定前，不创建绑定到某一场次的提醒。</w:t>
+        <w:t>系统仅追问当前缺失且能区分候选项的信息（如城市、日期或场次）；信息足以区分后，展示对应候选活动卡片。用户明确确认某一活动前，不进入提醒设置且不创建提醒。</w:t>
       </w:r>
     </w:p>
     <w:p>
@@ -2293,7 +2233,7 @@
           <w:color w:val="17324D"/>
           <w:sz w:val="19"/>
         </w:rPr>
-        <w:t>系统返回创建成功及提醒详情。提醒触发时刻、通知渠道、时区和提前量必须在评审中确定后，才能形成最终验收条件。</w:t>
+        <w:t>系统返回创建成功及提醒详情，并按用户选择的提前量安排提醒；用户可多选提前 1 天、1 小时、10 分钟，默认提前 1 小时，每个所选提前量各触发一次。通知通过邮箱发送；首期全站采用中国标准时间 Asia/Shanghai（UTC+8）。</w:t>
       </w:r>
     </w:p>
     <w:p>
@@ -2380,7 +2320,7 @@
           <w:color w:val="17324D"/>
           <w:sz w:val="19"/>
         </w:rPr>
-        <w:t>系统确认取消并更新提醒状态；到达原计划时间后，该提醒不再发送。已发送或已过期提醒的处理规则待评审。</w:t>
+        <w:t>系统确认取消并更新提醒状态；该提醒的所有未发送通知均停止，到达原计划时间后不再发送；已发送通知保留历史记录，不作撤回。</w:t>
       </w:r>
     </w:p>
     <w:p>
@@ -2467,7 +2407,322 @@
           <w:color w:val="17324D"/>
           <w:sz w:val="19"/>
         </w:rPr>
-        <w:t>系统并列展示冲突内容及来源，不静默选择一个时间。冲突状态下能否由用户选定其中一项并继续创建提醒，待评审。</w:t>
+        <w:t>系统并列展示冲突内容、来源和证据，不静默选择一个时间；在认可的官方来源核验一致前，禁止基于冲突信息创建提醒。</w:t>
+      </w:r>
+    </w:p>
+    <w:p>
+      <w:pPr>
+        <w:pStyle w:val="Heading2"/>
+      </w:pPr>
+      <w:r>
+        <w:t>AC-08 来源信息已过期</w:t>
+      </w:r>
+    </w:p>
+    <w:p>
+      <w:pPr/>
+      <w:r>
+        <w:rPr>
+          <w:b/>
+        </w:rPr>
+        <w:t xml:space="preserve">前置条件  </w:t>
+      </w:r>
+      <w:r>
+        <w:t>该信息自最近一次成功官方核验起已达到对应有效期：开票时间或活动状态为 6 小时，演出日期或地点为 24 小时。</w:t>
+      </w:r>
+    </w:p>
+    <w:p>
+      <w:pPr/>
+      <w:r>
+        <w:rPr>
+          <w:b/>
+        </w:rPr>
+        <w:t xml:space="preserve">操作  </w:t>
+      </w:r>
+      <w:r>
+        <w:t>用户查询活动信息或尝试基于该信息创建提醒。</w:t>
+      </w:r>
+    </w:p>
+    <w:p>
+      <w:pPr/>
+      <w:r>
+        <w:rPr>
+          <w:b/>
+        </w:rPr>
+        <w:t xml:space="preserve">验收结果  </w:t>
+      </w:r>
+      <w:r>
+        <w:t>系统显示上次成功官方核验时间并提示用户刷新；重新核验成功前，不得基于已过期信息创建提醒。</w:t>
+      </w:r>
+    </w:p>
+    <w:p>
+      <w:pPr>
+        <w:pStyle w:val="Heading2"/>
+        <w:keepNext/>
+      </w:pPr>
+      <w:r>
+        <w:t>AC-09 重复创建同一场次和提前量</w:t>
+      </w:r>
+    </w:p>
+    <w:p>
+      <w:pPr>
+        <w:keepNext/>
+      </w:pPr>
+      <w:r>
+        <w:rPr>
+          <w:b/>
+        </w:rPr>
+        <w:t xml:space="preserve">前置条件  </w:t>
+      </w:r>
+      <w:r>
+        <w:t>同一用户已存在一条有效提醒，且该提醒绑定到某一场次和一个提前量。</w:t>
+      </w:r>
+    </w:p>
+    <w:p>
+      <w:pPr>
+        <w:keepNext/>
+      </w:pPr>
+      <w:r>
+        <w:rPr>
+          <w:b/>
+        </w:rPr>
+        <w:t xml:space="preserve">操作  </w:t>
+      </w:r>
+      <w:r>
+        <w:t>用户再次为同一场次提交相同提前量的提醒创建请求。</w:t>
+      </w:r>
+    </w:p>
+    <w:p>
+      <w:pPr/>
+      <w:r>
+        <w:rPr>
+          <w:b/>
+        </w:rPr>
+        <w:t xml:space="preserve">验收结果  </w:t>
+      </w:r>
+      <w:r>
+        <w:t>系统不新增重复提醒触发项，并向用户呈现已存在的提醒；用户为同一场次选择不同提前量时，可分别创建对应提醒。</w:t>
+      </w:r>
+    </w:p>
+    <w:p>
+      <w:pPr>
+        <w:pStyle w:val="Heading2"/>
+        <w:keepNext/>
+      </w:pPr>
+      <w:r>
+        <w:t>AC-10 核验后的活动时间变更</w:t>
+      </w:r>
+    </w:p>
+    <w:p>
+      <w:pPr>
+        <w:keepNext/>
+      </w:pPr>
+      <w:r>
+        <w:rPr>
+          <w:b/>
+        </w:rPr>
+        <w:t xml:space="preserve">前置条件  </w:t>
+      </w:r>
+      <w:r>
+        <w:t>活动开场或开票开始时间已被认可来源核验，且用户存在尚未发送的相关提醒。</w:t>
+      </w:r>
+    </w:p>
+    <w:p>
+      <w:pPr>
+        <w:keepNext/>
+      </w:pPr>
+      <w:r>
+        <w:rPr>
+          <w:b/>
+        </w:rPr>
+        <w:t xml:space="preserve">操作  </w:t>
+      </w:r>
+      <w:r>
+        <w:t>认可来源核验确认活动时间发生变更，系统接收并处理更新后的时间。</w:t>
+      </w:r>
+    </w:p>
+    <w:p>
+      <w:pPr/>
+      <w:r>
+        <w:rPr>
+          <w:b/>
+        </w:rPr>
+        <w:t xml:space="preserve">验收结果  </w:t>
+      </w:r>
+      <w:r>
+        <w:t>系统按新时间及用户已选提前量重算所有未发送提醒，并通过邮件告知时间变更和新的提醒安排；已发送通知保留历史记录，不撤回。</w:t>
+      </w:r>
+    </w:p>
+    <w:p>
+      <w:pPr>
+        <w:pStyle w:val="Heading2"/>
+      </w:pPr>
+      <w:r>
+        <w:t>AC-11 清单外信息源的标识与使用</w:t>
+      </w:r>
+    </w:p>
+    <w:p>
+      <w:pPr/>
+      <w:r>
+        <w:rPr>
+          <w:b/>
+        </w:rPr>
+        <w:t xml:space="preserve">前置条件  </w:t>
+      </w:r>
+      <w:r>
+        <w:t>查询结果中存在未收录于首期官方来源清单的公开页面，或媒体/粉丝来源。</w:t>
+      </w:r>
+    </w:p>
+    <w:p>
+      <w:pPr/>
+      <w:r>
+        <w:rPr>
+          <w:b/>
+        </w:rPr>
+        <w:t xml:space="preserve">操作  </w:t>
+      </w:r>
+      <w:r>
+        <w:t>系统将来源信息与维护的官方来源清单匹配，并根据匹配结果展示。</w:t>
+      </w:r>
+    </w:p>
+    <w:p>
+      <w:pPr/>
+      <w:r>
+        <w:rPr>
+          <w:b/>
+        </w:rPr>
+        <w:t xml:space="preserve">验收结果  </w:t>
+      </w:r>
+      <w:r>
+        <w:t>仅将清单内已核验的账号/域名标记为官方；清单外来源仅能作为未核实线索展示，不得单独作为提醒依据。</w:t>
+      </w:r>
+    </w:p>
+    <w:p>
+      <w:pPr>
+        <w:pStyle w:val="Heading2"/>
+        <w:keepNext/>
+      </w:pPr>
+      <w:r>
+        <w:t>AC-12 官方来源分层匹配</w:t>
+      </w:r>
+    </w:p>
+    <w:p>
+      <w:pPr>
+        <w:pStyle w:val="Heading2"/>
+        <w:keepNext/>
+      </w:pPr>
+      <w:r>
+        <w:t>AC-13 平台级来源清单准入评审</w:t>
+      </w:r>
+    </w:p>
+    <w:p>
+      <w:pPr>
+        <w:keepNext/>
+        <w:keepLines/>
+        <w:spacing w:after="60" w:line="264" w:lineRule="auto"/>
+      </w:pPr>
+      <w:r>
+        <w:rPr>
+          <w:rFonts w:ascii="Microsoft YaHei" w:hAnsi="Microsoft YaHei" w:eastAsia="Microsoft YaHei"/>
+          <w:b/>
+          <w:color w:val="287A8A"/>
+          <w:sz w:val="19"/>
+        </w:rPr>
+        <w:t xml:space="preserve">前置条件  </w:t>
+      </w:r>
+      <w:r>
+        <w:rPr>
+          <w:rFonts w:ascii="Microsoft YaHei" w:hAnsi="Microsoft YaHei" w:eastAsia="Microsoft YaHei"/>
+          <w:color w:val="17324D"/>
+          <w:sz w:val="19"/>
+        </w:rPr>
+        <w:t>存在拟纳入首期平台级清单的候选域名。</w:t>
+      </w:r>
+    </w:p>
+    <w:p>
+      <w:pPr>
+        <w:keepNext/>
+        <w:keepLines/>
+        <w:spacing w:after="60" w:line="264" w:lineRule="auto"/>
+      </w:pPr>
+      <w:r>
+        <w:rPr>
+          <w:rFonts w:ascii="Microsoft YaHei" w:hAnsi="Microsoft YaHei" w:eastAsia="Microsoft YaHei"/>
+          <w:b/>
+          <w:color w:val="287A8A"/>
+          <w:sz w:val="19"/>
+        </w:rPr>
+        <w:t xml:space="preserve">操作  </w:t>
+      </w:r>
+      <w:r>
+        <w:rPr>
+          <w:rFonts w:ascii="Microsoft YaHei" w:hAnsi="Microsoft YaHei" w:eastAsia="Microsoft YaHei"/>
+          <w:color w:val="17324D"/>
+          <w:sz w:val="19"/>
+        </w:rPr>
+        <w:t>产品与研发共同记录并评审：页面可访问性、活动/场次字段、开票时间与状态字段可得性、字段稳定性、官方身份依据、更新频率和访问/授权边界。</w:t>
+      </w:r>
+    </w:p>
+    <w:p>
+      <w:pPr>
+        <w:keepLines/>
+        <w:spacing w:after="60" w:line="264" w:lineRule="auto"/>
+      </w:pPr>
+      <w:r>
+        <w:rPr>
+          <w:rFonts w:ascii="Microsoft YaHei" w:hAnsi="Microsoft YaHei" w:eastAsia="Microsoft YaHei"/>
+          <w:b/>
+          <w:color w:val="287A8A"/>
+          <w:sz w:val="19"/>
+        </w:rPr>
+        <w:t xml:space="preserve">验收结果  </w:t>
+      </w:r>
+      <w:r>
+        <w:rPr>
+          <w:rFonts w:ascii="Microsoft YaHei" w:hAnsi="Microsoft YaHei" w:eastAsia="Microsoft YaHei"/>
+          <w:color w:val="17324D"/>
+          <w:sz w:val="19"/>
+        </w:rPr>
+        <w:t>全部维度均有记录且经评审通过后，域名方可纳入首期平台级清单；未评审或未通过的候选域名不得进入清单或自动查询范围。</w:t>
+      </w:r>
+    </w:p>
+    <w:p>
+      <w:pPr>
+        <w:keepNext/>
+      </w:pPr>
+      <w:r>
+        <w:rPr>
+          <w:b/>
+        </w:rPr>
+        <w:t xml:space="preserve">前置条件  </w:t>
+      </w:r>
+      <w:r>
+        <w:t>查询结果包含固定票务/公告平台页面，或具体场次相关的艺人、主办方或场馆账号或链接。</w:t>
+      </w:r>
+    </w:p>
+    <w:p>
+      <w:pPr>
+        <w:keepNext/>
+      </w:pPr>
+      <w:r>
+        <w:rPr>
+          <w:b/>
+        </w:rPr>
+        <w:t xml:space="preserve">操作  </w:t>
+      </w:r>
+      <w:r>
+        <w:t>系统分别将来源与平台级域名清单及活动级账号/链接记录匹配。</w:t>
+      </w:r>
+    </w:p>
+    <w:p>
+      <w:pPr/>
+      <w:r>
+        <w:rPr>
+          <w:b/>
+        </w:rPr>
+        <w:t xml:space="preserve">验收结果  </w:t>
+      </w:r>
+      <w:r>
+        <w:t>平台级来源须匹配已评审的清单域名；活动级账号/链接须核验并绑定目标活动。仅匹配相应层级且核验通过的来源可标记为官方；其他来源只作为未核实线索，不得作为提醒依据。</w:t>
       </w:r>
     </w:p>
     <w:p>
@@ -2489,9 +2744,27 @@
     <w:p>
       <w:pPr>
         <w:pStyle w:val="ListBullet"/>
+        <w:spacing w:line="240" w:lineRule="auto" w:after="0"/>
+      </w:pPr>
+      <w:r>
+        <w:t>官方来源清单分平台级和活动级维护：前者登记固定票务/公告域名，后者逐场次核验艺人、主办方或场馆账号/链接并关联活动。仅匹配对应清单且核验通过的记录可标记为官方；清单外页面只作为未核实线索。</w:t>
+      </w:r>
+    </w:p>
+    <w:p>
+      <w:pPr>
+        <w:pStyle w:val="ListBullet"/>
+        <w:spacing w:line="240" w:lineRule="auto" w:after="0"/>
+      </w:pPr>
+      <w:r>
+        <w:t>首期平台级清单由产品与研发摸排并评审确认，仅纳入小范围域名；调研准入维度按 AC-13 执行，首期不承诺覆盖全部票务或公告平台。</w:t>
+      </w:r>
+    </w:p>
+    <w:p>
+      <w:pPr>
+        <w:pStyle w:val="ListBullet"/>
         <w:keepNext/>
         <w:keepLines/>
-        <w:spacing w:after="30" w:line="259" w:lineRule="auto"/>
+        <w:spacing w:after="0" w:line="240" w:lineRule="auto"/>
         <w:ind w:left="317" w:hanging="230"/>
       </w:pPr>
       <w:r>
@@ -2506,18 +2779,10 @@
     <w:p>
       <w:pPr>
         <w:pStyle w:val="ListBullet"/>
-        <w:keepNext/>
-        <w:keepLines/>
-        <w:spacing w:after="30" w:line="259" w:lineRule="auto"/>
-        <w:ind w:left="317" w:hanging="230"/>
+        <w:spacing w:line="240" w:lineRule="auto" w:after="0"/>
       </w:pPr>
       <w:r>
-        <w:rPr>
-          <w:rFonts w:ascii="Microsoft YaHei" w:hAnsi="Microsoft YaHei" w:eastAsia="Microsoft YaHei"/>
-          <w:color w:val="17324D"/>
-          <w:sz w:val="20"/>
-        </w:rPr>
-        <w:t>对影响用户安排的信息保留来源链接、来源类型、发布账号、发布时间（如可获得）、查询时间和核实状态。具体展示字段由产品评审确认。</w:t>
+        <w:t>可用于提醒的信息字段以最近一次成功官方来源核验时间起算有效期：开票时间和活动状态为 6 小时，演出日期和地点为 24 小时；达到有效期后标记为过期，重新核验成功前不得用于创建提醒。</w:t>
       </w:r>
     </w:p>
     <w:p>
@@ -2525,7 +2790,19 @@
         <w:pStyle w:val="ListBullet"/>
         <w:keepNext/>
         <w:keepLines/>
-        <w:spacing w:after="30" w:line="259" w:lineRule="auto"/>
+        <w:spacing w:after="0" w:line="240" w:lineRule="auto"/>
+        <w:ind w:left="317" w:hanging="230"/>
+      </w:pPr>
+      <w:r>
+        <w:t>对影响用户安排的信息保留来源链接、来源类型、发布账号、发布时间（如可获得）、查询时间、官方核验状态和最近核验时间。来源卡片主视图展示活动关键信息及来源类型/发布方、核验状态、最近核验时间和链接；发布时间与证据摘要（如可获得）置于展开详情。媒体或粉丝来源须明确标为未核实。</w:t>
+      </w:r>
+    </w:p>
+    <w:p>
+      <w:pPr>
+        <w:pStyle w:val="ListBullet"/>
+        <w:keepNext/>
+        <w:keepLines/>
+        <w:spacing w:after="0" w:line="240" w:lineRule="auto"/>
         <w:ind w:left="317" w:hanging="230"/>
       </w:pPr>
       <w:r>
@@ -2542,7 +2819,7 @@
         <w:pStyle w:val="ListBullet"/>
         <w:keepNext w:val="0"/>
         <w:keepLines/>
-        <w:spacing w:after="30" w:line="259" w:lineRule="auto"/>
+        <w:spacing w:after="0" w:line="240" w:lineRule="auto"/>
         <w:ind w:left="317" w:hanging="230"/>
       </w:pPr>
       <w:r>
@@ -2898,16 +3175,11 @@
       <w:pPr>
         <w:pStyle w:val="Heading1"/>
         <w:keepNext/>
+        <w:pageBreakBefore/>
         <w:spacing w:before="180" w:after="80"/>
       </w:pPr>
       <w:r>
-        <w:rPr>
-          <w:rFonts w:ascii="Microsoft YaHei" w:hAnsi="Microsoft YaHei" w:eastAsia="Microsoft YaHei"/>
-          <w:b/>
-          <w:color w:val="17324D"/>
-          <w:sz w:val="30"/>
-        </w:rPr>
-        <w:t>08 跨职能评审待决项</w:t>
+        <w:t>08 跨职能评审决策记录</w:t>
       </w:r>
     </w:p>
     <w:tbl>
@@ -2980,7 +3252,7 @@
                 <w:color w:val="FFFFFF"/>
                 <w:sz w:val="18"/>
               </w:rPr>
-              <w:t>待决问题</w:t>
+              <w:t>决策议题</w:t>
             </w:r>
           </w:p>
         </w:tc>
@@ -3141,15 +3413,8 @@
             <w:pPr>
               <w:spacing w:after="0" w:before="0" w:line="269" w:lineRule="auto"/>
             </w:pPr>
-            <w:r/>
             <w:r>
-              <w:rPr>
-                <w:rFonts w:ascii="Microsoft YaHei" w:hAnsi="Microsoft YaHei" w:eastAsia="Microsoft YaHei"/>
-                <w:b/>
-                <w:color w:val="536273"/>
-                <w:sz w:val="16"/>
-              </w:rPr>
-              <w:t>待决</w:t>
+              <w:t>已确认</w:t>
             </w:r>
           </w:p>
         </w:tc>
@@ -3258,15 +3523,8 @@
             <w:pPr>
               <w:spacing w:after="0" w:before="0" w:line="269" w:lineRule="auto"/>
             </w:pPr>
-            <w:r/>
             <w:r>
-              <w:rPr>
-                <w:rFonts w:ascii="Microsoft YaHei" w:hAnsi="Microsoft YaHei" w:eastAsia="Microsoft YaHei"/>
-                <w:b/>
-                <w:color w:val="536273"/>
-                <w:sz w:val="16"/>
-              </w:rPr>
-              <w:t>待决</w:t>
+              <w:t>已确认</w:t>
             </w:r>
           </w:p>
         </w:tc>
@@ -3368,18 +3626,8 @@
             </w:tcMar>
           </w:tcPr>
           <w:p>
-            <w:pPr>
-              <w:spacing w:after="0" w:before="0" w:line="269" w:lineRule="auto"/>
-            </w:pPr>
-            <w:r/>
             <w:r>
-              <w:rPr>
-                <w:rFonts w:ascii="Microsoft YaHei" w:hAnsi="Microsoft YaHei" w:eastAsia="Microsoft YaHei"/>
-                <w:b/>
-                <w:color w:val="536273"/>
-                <w:sz w:val="16"/>
-              </w:rPr>
-              <w:t>待决</w:t>
+              <w:t>已确认</w:t>
             </w:r>
           </w:p>
         </w:tc>
@@ -3485,18 +3733,8 @@
             </w:tcMar>
           </w:tcPr>
           <w:p>
-            <w:pPr>
-              <w:spacing w:after="0" w:before="0" w:line="269" w:lineRule="auto"/>
-            </w:pPr>
-            <w:r/>
             <w:r>
-              <w:rPr>
-                <w:rFonts w:ascii="Microsoft YaHei" w:hAnsi="Microsoft YaHei" w:eastAsia="Microsoft YaHei"/>
-                <w:b/>
-                <w:color w:val="536273"/>
-                <w:sz w:val="16"/>
-              </w:rPr>
-              <w:t>待决</w:t>
+              <w:t>已确认</w:t>
             </w:r>
           </w:p>
         </w:tc>
@@ -3598,18 +3836,8 @@
             </w:tcMar>
           </w:tcPr>
           <w:p>
-            <w:pPr>
-              <w:spacing w:after="0" w:before="0" w:line="269" w:lineRule="auto"/>
-            </w:pPr>
-            <w:r/>
             <w:r>
-              <w:rPr>
-                <w:rFonts w:ascii="Microsoft YaHei" w:hAnsi="Microsoft YaHei" w:eastAsia="Microsoft YaHei"/>
-                <w:b/>
-                <w:color w:val="536273"/>
-                <w:sz w:val="16"/>
-              </w:rPr>
-              <w:t>待决</w:t>
+              <w:t>已确认</w:t>
             </w:r>
           </w:p>
         </w:tc>
@@ -3715,18 +3943,8 @@
             </w:tcMar>
           </w:tcPr>
           <w:p>
-            <w:pPr>
-              <w:spacing w:after="0" w:before="0" w:line="269" w:lineRule="auto"/>
-            </w:pPr>
-            <w:r/>
             <w:r>
-              <w:rPr>
-                <w:rFonts w:ascii="Microsoft YaHei" w:hAnsi="Microsoft YaHei" w:eastAsia="Microsoft YaHei"/>
-                <w:b/>
-                <w:color w:val="536273"/>
-                <w:sz w:val="16"/>
-              </w:rPr>
-              <w:t>待决</w:t>
+              <w:t>已确认</w:t>
             </w:r>
           </w:p>
         </w:tc>
@@ -3828,18 +4046,8 @@
             </w:tcMar>
           </w:tcPr>
           <w:p>
-            <w:pPr>
-              <w:spacing w:after="0" w:before="0" w:line="269" w:lineRule="auto"/>
-            </w:pPr>
-            <w:r/>
             <w:r>
-              <w:rPr>
-                <w:rFonts w:ascii="Microsoft YaHei" w:hAnsi="Microsoft YaHei" w:eastAsia="Microsoft YaHei"/>
-                <w:b/>
-                <w:color w:val="536273"/>
-                <w:sz w:val="16"/>
-              </w:rPr>
-              <w:t>待决</w:t>
+              <w:t>已确认</w:t>
             </w:r>
           </w:p>
         </w:tc>
@@ -3945,18 +4153,238 @@
             </w:tcMar>
           </w:tcPr>
           <w:p>
-            <w:pPr>
-              <w:spacing w:after="0" w:before="0" w:line="269" w:lineRule="auto"/>
-            </w:pPr>
-            <w:r/>
             <w:r>
-              <w:rPr>
-                <w:rFonts w:ascii="Microsoft YaHei" w:hAnsi="Microsoft YaHei" w:eastAsia="Microsoft YaHei"/>
-                <w:b/>
-                <w:color w:val="536273"/>
-                <w:sz w:val="16"/>
-              </w:rPr>
-              <w:t>待决</w:t>
+              <w:t>已确认</w:t>
+            </w:r>
+          </w:p>
+        </w:tc>
+      </w:tr>
+      <w:tr>
+        <w:tc>
+          <w:tcPr>
+            <w:tcW w:type="dxa" w:w="792"/>
+            <w:vAlign w:val="center"/>
+          </w:tcPr>
+          <w:p>
+            <w:r>
+              <w:t>D-09</w:t>
+            </w:r>
+          </w:p>
+        </w:tc>
+        <w:tc>
+          <w:tcPr>
+            <w:tcW w:type="dxa" w:w="5112"/>
+            <w:vAlign w:val="center"/>
+          </w:tcPr>
+          <w:p>
+            <w:r>
+              <w:t>同一艺人匹配多个活动或场次时，如何澄清并确认目标？</w:t>
+            </w:r>
+          </w:p>
+        </w:tc>
+        <w:tc>
+          <w:tcPr>
+            <w:tcW w:type="dxa" w:w="1584"/>
+            <w:vAlign w:val="center"/>
+          </w:tcPr>
+          <w:p>
+            <w:r>
+              <w:t>产品 / 设计</w:t>
+            </w:r>
+          </w:p>
+        </w:tc>
+        <w:tc>
+          <w:tcPr>
+            <w:tcW w:type="dxa" w:w="1080"/>
+            <w:vAlign w:val="center"/>
+          </w:tcPr>
+          <w:p>
+            <w:r>
+              <w:t>已确认</w:t>
+            </w:r>
+          </w:p>
+        </w:tc>
+      </w:tr>
+      <w:tr>
+        <w:tc>
+          <w:tcPr>
+            <w:tcW w:type="dxa" w:w="792"/>
+            <w:vAlign w:val="center"/>
+          </w:tcPr>
+          <w:p>
+            <w:r>
+              <w:t>D-10</w:t>
+            </w:r>
+          </w:p>
+        </w:tc>
+        <w:tc>
+          <w:tcPr>
+            <w:tcW w:type="dxa" w:w="5112"/>
+            <w:vAlign w:val="center"/>
+          </w:tcPr>
+          <w:p>
+            <w:r>
+              <w:t>首期如何认定官方来源并用于核验？</w:t>
+            </w:r>
+          </w:p>
+        </w:tc>
+        <w:tc>
+          <w:tcPr>
+            <w:tcW w:type="dxa" w:w="1584"/>
+            <w:vAlign w:val="center"/>
+          </w:tcPr>
+          <w:p>
+            <w:r>
+              <w:t>产品 / 研发</w:t>
+            </w:r>
+          </w:p>
+        </w:tc>
+        <w:tc>
+          <w:tcPr>
+            <w:tcW w:type="dxa" w:w="1080"/>
+            <w:vAlign w:val="center"/>
+          </w:tcPr>
+          <w:p>
+            <w:r>
+              <w:t>已确认</w:t>
+            </w:r>
+          </w:p>
+        </w:tc>
+      </w:tr>
+      <w:tr>
+        <w:tc>
+          <w:tcPr>
+            <w:tcW w:type="dxa" w:w="792"/>
+            <w:vAlign w:val="center"/>
+          </w:tcPr>
+          <w:p>
+            <w:r>
+              <w:t>D-11</w:t>
+            </w:r>
+          </w:p>
+        </w:tc>
+        <w:tc>
+          <w:tcPr>
+            <w:tcW w:type="dxa" w:w="5112"/>
+            <w:vAlign w:val="center"/>
+          </w:tcPr>
+          <w:p>
+            <w:r>
+              <w:t>官方来源清单应如何分层维护？</w:t>
+            </w:r>
+          </w:p>
+        </w:tc>
+        <w:tc>
+          <w:tcPr>
+            <w:tcW w:type="dxa" w:w="1584"/>
+            <w:vAlign w:val="center"/>
+          </w:tcPr>
+          <w:p>
+            <w:r>
+              <w:t>产品 / 研发</w:t>
+            </w:r>
+          </w:p>
+        </w:tc>
+        <w:tc>
+          <w:tcPr>
+            <w:tcW w:type="dxa" w:w="1080"/>
+            <w:vAlign w:val="center"/>
+          </w:tcPr>
+          <w:p>
+            <w:r>
+              <w:t>已确认</w:t>
+            </w:r>
+          </w:p>
+        </w:tc>
+      </w:tr>
+      <w:tr>
+        <w:tc>
+          <w:tcPr>
+            <w:tcW w:type="dxa" w:w="792"/>
+            <w:vAlign w:val="center"/>
+          </w:tcPr>
+          <w:p>
+            <w:r>
+              <w:t>D-12</w:t>
+            </w:r>
+          </w:p>
+        </w:tc>
+        <w:tc>
+          <w:tcPr>
+            <w:tcW w:type="dxa" w:w="5112"/>
+            <w:vAlign w:val="center"/>
+          </w:tcPr>
+          <w:p>
+            <w:r>
+              <w:t>首期平台级清单的域名范围如何确定？</w:t>
+            </w:r>
+          </w:p>
+        </w:tc>
+        <w:tc>
+          <w:tcPr>
+            <w:tcW w:type="dxa" w:w="1584"/>
+            <w:vAlign w:val="center"/>
+          </w:tcPr>
+          <w:p>
+            <w:r>
+              <w:t>产品 / 研发</w:t>
+            </w:r>
+          </w:p>
+        </w:tc>
+        <w:tc>
+          <w:tcPr>
+            <w:tcW w:type="dxa" w:w="1080"/>
+            <w:vAlign w:val="center"/>
+          </w:tcPr>
+          <w:p>
+            <w:r>
+              <w:t>已确认</w:t>
+            </w:r>
+          </w:p>
+        </w:tc>
+      </w:tr>
+      <w:tr>
+        <w:tc>
+          <w:tcPr>
+            <w:tcW w:type="dxa" w:w="792"/>
+            <w:vAlign w:val="center"/>
+          </w:tcPr>
+          <w:p>
+            <w:r>
+              <w:t>D-13</w:t>
+            </w:r>
+          </w:p>
+        </w:tc>
+        <w:tc>
+          <w:tcPr>
+            <w:tcW w:type="dxa" w:w="5112"/>
+            <w:vAlign w:val="center"/>
+          </w:tcPr>
+          <w:p>
+            <w:r>
+              <w:t>平台级域名的首期调研应记录哪些准入维度？</w:t>
+            </w:r>
+          </w:p>
+        </w:tc>
+        <w:tc>
+          <w:tcPr>
+            <w:tcW w:type="dxa" w:w="1584"/>
+            <w:vAlign w:val="center"/>
+          </w:tcPr>
+          <w:p>
+            <w:r>
+              <w:t>产品 / 研发</w:t>
+            </w:r>
+          </w:p>
+        </w:tc>
+        <w:tc>
+          <w:tcPr>
+            <w:tcW w:type="dxa" w:w="1080"/>
+            <w:vAlign w:val="center"/>
+          </w:tcPr>
+          <w:p>
+            <w:r>
+              <w:t>已确认</w:t>
             </w:r>
           </w:p>
         </w:tc>
@@ -3976,6 +4404,7 @@
       <w:pPr>
         <w:pStyle w:val="Heading1"/>
         <w:keepNext/>
+        <w:pageBreakBefore/>
         <w:spacing w:before="180" w:after="80"/>
       </w:pPr>
       <w:r>
@@ -3991,18 +4420,49 @@
     <w:p>
       <w:pPr>
         <w:pStyle w:val="ListBullet"/>
-        <w:keepNext/>
-        <w:keepLines/>
-        <w:spacing w:after="30" w:line="259" w:lineRule="auto"/>
-        <w:ind w:left="317" w:hanging="230"/>
       </w:pPr>
       <w:r>
-        <w:rPr>
-          <w:rFonts w:ascii="Microsoft YaHei" w:hAnsi="Microsoft YaHei" w:eastAsia="Microsoft YaHei"/>
-          <w:color w:val="17324D"/>
-          <w:sz w:val="20"/>
-        </w:rPr>
-        <w:t>D-01 至 D-05 等会改变用户可见行为的 P0 待决项已明确。</w:t>
+        <w:t>D-01 已确认：首期艺人范围不限；地域范围为中国大陆，城市不限；活动类型覆盖演唱会、巡演及其相关开票信息。</w:t>
+      </w:r>
+    </w:p>
+    <w:p>
+      <w:pPr>
+        <w:pStyle w:val="ListBullet"/>
+      </w:pPr>
+      <w:r>
+        <w:t>D-02 已确认：官方核验来源包括艺人本人、工作室或经纪公司、主办方、场馆及官方票务页面；自动查询仅面向公开页面。媒体和粉丝来源可作为线索展示，但须标为未核实，不能作为活动或开票时间的核验依据。</w:t>
+      </w:r>
+    </w:p>
+    <w:p>
+      <w:pPr>
+        <w:pStyle w:val="ListBullet"/>
+      </w:pPr>
+      <w:r>
+        <w:t>D-03 已确认：查询结果以来源卡片呈现候选活动及其来源；用户点击卡片上的“确认此活动”后，才进入提醒设置；未确认前不得创建提醒。</w:t>
+      </w:r>
+    </w:p>
+    <w:p>
+      <w:pPr>
+        <w:pStyle w:val="ListBullet"/>
+      </w:pPr>
+      <w:r>
+        <w:t>D-04 已确认：以已确认活动的演出开场时间或开票开始时间为基准，用户可选择提前 1 天、1 小时或 10 分钟提醒，可多选，默认提前 1 小时；每个所选提前量各触发一次。通知渠道采用邮箱；首期全站统一采用中国标准时间 Asia/Shanghai（UTC+8）。</w:t>
+      </w:r>
+    </w:p>
+    <w:p>
+      <w:pPr>
+        <w:pStyle w:val="ListBullet"/>
+      </w:pPr>
+      <w:r>
+        <w:t>D-05 已确认：首期提醒通知渠道采用邮箱；全站统一采用中国标准时间 Asia/Shanghai（UTC+8）。</w:t>
+      </w:r>
+    </w:p>
+    <w:p>
+      <w:pPr>
+        <w:pStyle w:val="ListBullet"/>
+      </w:pPr>
+      <w:r>
+        <w:t>D-06 已确认：查询失败时提示“查询暂时失败”并提供重试；来源冲突时并列展示各来源和证据、不自行判断，且在认可的官方来源核验一致前禁止基于冲突信息创建提醒；来源过期时显示上次成功官方核验时间并提示刷新，重新核验前不作为提醒依据。开票时间和活动状态有效期为 6 小时，演出日期和地点为 24 小时，均从最近一次成功官方核验起算。</w:t>
       </w:r>
     </w:p>
     <w:p>
@@ -4014,12 +4474,7 @@
         <w:ind w:left="317" w:hanging="230"/>
       </w:pPr>
       <w:r>
-        <w:rPr>
-          <w:rFonts w:ascii="Microsoft YaHei" w:hAnsi="Microsoft YaHei" w:eastAsia="Microsoft YaHei"/>
-          <w:color w:val="17324D"/>
-          <w:sz w:val="20"/>
-        </w:rPr>
-        <w:t>首期认可信息源和可取得的数据字段已验证；没有授权或能力依据的来源不进入自动查询范围。</w:t>
+        <w:t>后续识别出的 P0 需求决策须在需求基线冻结前完成评审，并形成明确结论。</w:t>
       </w:r>
     </w:p>
     <w:p>
@@ -4031,12 +4486,63 @@
         <w:ind w:left="317" w:hanging="230"/>
       </w:pPr>
       <w:r>
-        <w:rPr>
-          <w:rFonts w:ascii="Microsoft YaHei" w:hAnsi="Microsoft YaHei" w:eastAsia="Microsoft YaHei"/>
-          <w:color w:val="17324D"/>
-          <w:sz w:val="20"/>
-        </w:rPr>
-        <w:t>提醒触发规则、发送渠道、时区和取消规则已写成确定的验收条件。</w:t>
+        <w:t>首期官方来源清单及其账号/域名和可取得的数据字段须完成验证；来源有效期按照第 06 节规则执行；没有授权或能力依据的来源不得进入自动查询范围；清单外来源不得被自动认定为官方或作为提醒依据。</w:t>
+      </w:r>
+    </w:p>
+    <w:p>
+      <w:pPr>
+        <w:pStyle w:val="ListBullet"/>
+      </w:pPr>
+      <w:r>
+        <w:t>D-07 已确认：同一用户对同一场次的同一提前量不重复创建有效提醒；活动时间经核验确认变更后，按已选提前量重排所有未发送提醒并邮件告知；取消提醒后停止该提醒所有未发送通知，已发送通知保留记录。</w:t>
+      </w:r>
+    </w:p>
+    <w:p>
+      <w:pPr>
+        <w:pStyle w:val="ListBullet"/>
+      </w:pPr>
+      <w:r>
+        <w:t>D-08 已确认：首期采用小范围试用，记录查询结果、官方来源核验、提醒确认/创建/取消、邮件发送结果及提醒生命周期指标；先积累试点基线，再据此评审数值目标，不预设首期硬性目标。具体口径见第 10 节。</w:t>
+      </w:r>
+    </w:p>
+    <w:p>
+      <w:pPr>
+        <w:pStyle w:val="ListBullet"/>
+      </w:pPr>
+      <w:r>
+        <w:t>D-09 已确认：匹配到多个活动或场次时，只追问能区分候选的缺失信息；随后展示候选卡片，用户明确确认前不进入提醒设置或创建提醒。</w:t>
+      </w:r>
+    </w:p>
+    <w:p>
+      <w:pPr>
+        <w:pStyle w:val="ListBullet"/>
+      </w:pPr>
+      <w:r>
+        <w:t>D-10 已确认：首期维护官方来源清单，以经确认的艺人本人、工作室/经纪公司、主办方、场馆及官方票务页面账号或域名为准；清单外公开页面只作为未核实线索，不单独作官方核验依据。</w:t>
+      </w:r>
+    </w:p>
+    <w:p>
+      <w:pPr>
+        <w:pStyle w:val="ListBullet"/>
+      </w:pPr>
+      <w:r>
+        <w:t>D-11 已确认：官方来源清单分两层维护；平台级收录固定票务/公告域名，活动级逐场次记录并核验艺人、主办方或场馆账号/链接，并关联对应活动。</w:t>
+      </w:r>
+    </w:p>
+    <w:p>
+      <w:pPr>
+        <w:pStyle w:val="ListBullet"/>
+      </w:pPr>
+      <w:r>
+        <w:t>D-12 已确认：首期平台级域名由产品与研发按公开可访问性和活动/开票字段稳定性进行摸排，经评审纳入小范围清单；首期不承诺全平台覆盖。</w:t>
+      </w:r>
+    </w:p>
+    <w:p>
+      <w:pPr>
+        <w:pStyle w:val="ListBullet"/>
+      </w:pPr>
+      <w:r>
+        <w:t>D-13 已确认：平台级候选域名须完整记录页面可访问性、活动/场次与开票时间和状态字段、字段稳定性、官方身份依据、更新频率以及访问/授权边界；产品与研发评审通过后才纳入首期平台级清单。</w:t>
       </w:r>
     </w:p>
     <w:p>
@@ -4048,12 +4554,19 @@
         <w:ind w:left="317" w:hanging="230"/>
       </w:pPr>
       <w:r>
-        <w:rPr>
-          <w:rFonts w:ascii="Microsoft YaHei" w:hAnsi="Microsoft YaHei" w:eastAsia="Microsoft YaHei"/>
-          <w:color w:val="17324D"/>
-          <w:sz w:val="20"/>
-        </w:rPr>
-        <w:t>测试已覆盖查询成功、待公布、查询失败、多场次澄清、来源冲突、提醒创建和取消。</w:t>
+        <w:t>提醒提前量、邮箱通知渠道和首期统一时区已确认；提醒去重、核验后时间变更重排及取消规则已在 D-07 中明确。</w:t>
+      </w:r>
+    </w:p>
+    <w:p>
+      <w:pPr>
+        <w:pStyle w:val="ListBullet"/>
+        <w:keepNext/>
+        <w:keepLines/>
+        <w:spacing w:after="30" w:line="259" w:lineRule="auto"/>
+        <w:ind w:left="317" w:hanging="230"/>
+      </w:pPr>
+      <w:r>
+        <w:t>测试须覆盖查询成功、待公布、查询失败、多场次澄清、来源冲突、提醒创建与重复请求去重、核验后时间变更重排、提醒取消。</w:t>
       </w:r>
     </w:p>
     <w:p>
@@ -4065,12 +4578,7 @@
         <w:ind w:left="317" w:hanging="230"/>
       </w:pPr>
       <w:r>
-        <w:rPr>
-          <w:rFonts w:ascii="Microsoft YaHei" w:hAnsi="Microsoft YaHei" w:eastAsia="Microsoft YaHei"/>
-          <w:color w:val="17324D"/>
-          <w:sz w:val="20"/>
-        </w:rPr>
-        <w:t>研发完成 cjxAgent 模块复用评估与技术拆分；需求基线不替代技术评审。</w:t>
+        <w:t>研发须完成 cjxAgent 模块复用评估与技术拆分；需求基线不替代技术评审。</w:t>
       </w:r>
     </w:p>
     <w:p>
@@ -4095,6 +4603,382 @@
         <w:t>通过评审后，将已确认的待决项更新到本文件，并将版本状态改为“已基线”；后续需求变更需同步更新验收条件。</w:t>
       </w:r>
     </w:p>
+    <w:p>
+      <w:pPr>
+        <w:pStyle w:val="Heading1"/>
+        <w:pageBreakBefore w:val="0"/>
+      </w:pPr>
+      <w:r>
+        <w:t>10 首期效果观测</w:t>
+      </w:r>
+    </w:p>
+    <w:p>
+      <w:pPr>
+        <w:keepNext/>
+      </w:pPr>
+      <w:r>
+        <w:t>首期采用小范围试用，先按下表记录状态、操作和发送结果，积累真实基线后再由产品、研发和测试共同评审目标值。MVP 阶段不预设缺少依据的数值门槛；试点对象与观测周期在试点计划中确定。</w:t>
+      </w:r>
+    </w:p>
+    <w:tbl>
+      <w:tblPr>
+        <w:tblStyle w:val="TableGrid"/>
+        <w:tblW w:type="auto" w:w="0"/>
+        <w:jc w:val="center"/>
+        <w:tblLayout w:type="fixed"/>
+        <w:tblLook w:firstColumn="1" w:firstRow="1" w:lastColumn="0" w:lastRow="0" w:noHBand="0" w:noVBand="1" w:val="04A0"/>
+      </w:tblPr>
+      <w:tblGrid>
+        <w:gridCol w:w="1944"/>
+        <w:gridCol w:w="4464"/>
+        <w:gridCol w:w="2664"/>
+      </w:tblGrid>
+      <w:tr>
+        <w:trPr>
+          <w:cantSplit/>
+        </w:trPr>
+        <w:tc>
+          <w:tcPr>
+            <w:tcW w:type="dxa" w:w="1944"/>
+            <w:vAlign w:val="center"/>
+            <w:shd w:fill="17324D"/>
+          </w:tcPr>
+          <w:p>
+            <w:pPr>
+              <w:spacing w:after="40"/>
+            </w:pPr>
+            <w:r>
+              <w:rPr>
+                <w:b/>
+                <w:color w:val="FFFFFF"/>
+                <w:sz w:val="18"/>
+              </w:rPr>
+              <w:t>指标</w:t>
+            </w:r>
+          </w:p>
+        </w:tc>
+        <w:tc>
+          <w:tcPr>
+            <w:tcW w:type="dxa" w:w="4464"/>
+            <w:vAlign w:val="center"/>
+            <w:shd w:fill="17324D"/>
+          </w:tcPr>
+          <w:p>
+            <w:pPr>
+              <w:spacing w:after="40"/>
+            </w:pPr>
+            <w:r>
+              <w:rPr>
+                <w:b/>
+                <w:color w:val="FFFFFF"/>
+                <w:sz w:val="18"/>
+              </w:rPr>
+              <w:t>记录口径</w:t>
+            </w:r>
+          </w:p>
+        </w:tc>
+        <w:tc>
+          <w:tcPr>
+            <w:tcW w:type="dxa" w:w="2664"/>
+            <w:vAlign w:val="center"/>
+            <w:shd w:fill="17324D"/>
+          </w:tcPr>
+          <w:p>
+            <w:pPr>
+              <w:spacing w:after="40"/>
+            </w:pPr>
+            <w:r>
+              <w:rPr>
+                <w:b/>
+                <w:color w:val="FFFFFF"/>
+                <w:sz w:val="18"/>
+              </w:rPr>
+              <w:t>首期使用方式</w:t>
+            </w:r>
+          </w:p>
+        </w:tc>
+      </w:tr>
+      <w:tr>
+        <w:trPr>
+          <w:cantSplit/>
+        </w:trPr>
+        <w:tc>
+          <w:tcPr>
+            <w:tcW w:type="dxa" w:w="1944"/>
+            <w:vAlign w:val="center"/>
+          </w:tcPr>
+          <w:p>
+            <w:pPr>
+              <w:spacing w:after="40"/>
+            </w:pPr>
+            <w:r>
+              <w:rPr>
+                <w:sz w:val="18"/>
+              </w:rPr>
+              <w:t>查询结果与状态清晰度</w:t>
+            </w:r>
+          </w:p>
+        </w:tc>
+        <w:tc>
+          <w:tcPr>
+            <w:tcW w:type="dxa" w:w="4464"/>
+            <w:vAlign w:val="center"/>
+          </w:tcPr>
+          <w:p>
+            <w:pPr>
+              <w:spacing w:after="40"/>
+            </w:pPr>
+            <w:r>
+              <w:rPr>
+                <w:sz w:val="18"/>
+              </w:rPr>
+              <w:t>按有效查询记录返回状态分布：可用信息、待公布、查询暂时失败、来源冲突、来源过期；同时记录明确返回状态的查询数/有效查询数。</w:t>
+            </w:r>
+          </w:p>
+        </w:tc>
+        <w:tc>
+          <w:tcPr>
+            <w:tcW w:type="dxa" w:w="2664"/>
+            <w:vAlign w:val="center"/>
+          </w:tcPr>
+          <w:p>
+            <w:pPr>
+              <w:spacing w:after="40"/>
+            </w:pPr>
+            <w:r>
+              <w:rPr>
+                <w:sz w:val="18"/>
+              </w:rPr>
+              <w:t>“待公布”是有效业务状态，不计为查询失败；观察查询链路是否清楚区分结果。</w:t>
+            </w:r>
+          </w:p>
+        </w:tc>
+      </w:tr>
+      <w:tr>
+        <w:trPr>
+          <w:cantSplit/>
+        </w:trPr>
+        <w:tc>
+          <w:tcPr>
+            <w:tcW w:type="dxa" w:w="1944"/>
+            <w:vAlign w:val="center"/>
+          </w:tcPr>
+          <w:p>
+            <w:pPr>
+              <w:spacing w:after="40"/>
+            </w:pPr>
+            <w:r>
+              <w:rPr>
+                <w:sz w:val="18"/>
+              </w:rPr>
+              <w:t>官方来源核验覆盖</w:t>
+            </w:r>
+          </w:p>
+        </w:tc>
+        <w:tc>
+          <w:tcPr>
+            <w:tcW w:type="dxa" w:w="4464"/>
+            <w:vAlign w:val="center"/>
+          </w:tcPr>
+          <w:p>
+            <w:pPr>
+              <w:spacing w:after="40"/>
+            </w:pPr>
+            <w:r>
+              <w:rPr>
+                <w:sz w:val="18"/>
+              </w:rPr>
+              <w:t>记录展示候选活动中具有可访问官方来源且标明核验状态的数量；媒体/粉丝线索单独计数，不计为官方核验。</w:t>
+            </w:r>
+          </w:p>
+        </w:tc>
+        <w:tc>
+          <w:tcPr>
+            <w:tcW w:type="dxa" w:w="2664"/>
+            <w:vAlign w:val="center"/>
+          </w:tcPr>
+          <w:p>
+            <w:pPr>
+              <w:spacing w:after="40"/>
+            </w:pPr>
+            <w:r>
+              <w:rPr>
+                <w:sz w:val="18"/>
+              </w:rPr>
+              <w:t>了解 MVP 能否稳定呈现符合来源规则的信息，不预设覆盖率目标。</w:t>
+            </w:r>
+          </w:p>
+        </w:tc>
+      </w:tr>
+      <w:tr>
+        <w:trPr>
+          <w:cantSplit/>
+        </w:trPr>
+        <w:tc>
+          <w:tcPr>
+            <w:tcW w:type="dxa" w:w="1944"/>
+            <w:vAlign w:val="center"/>
+          </w:tcPr>
+          <w:p>
+            <w:pPr>
+              <w:spacing w:after="40"/>
+            </w:pPr>
+            <w:r>
+              <w:rPr>
+                <w:sz w:val="18"/>
+              </w:rPr>
+              <w:t>用户确认与提醒转化</w:t>
+            </w:r>
+          </w:p>
+        </w:tc>
+        <w:tc>
+          <w:tcPr>
+            <w:tcW w:type="dxa" w:w="4464"/>
+            <w:vAlign w:val="center"/>
+          </w:tcPr>
+          <w:p>
+            <w:pPr>
+              <w:spacing w:after="40"/>
+            </w:pPr>
+            <w:r>
+              <w:rPr>
+                <w:sz w:val="18"/>
+              </w:rPr>
+              <w:t>按用户和场次记录来源确认、提醒创建、提醒取消；观察已确认场次中创建至少一条提醒的比例，并记录创建后取消量。</w:t>
+            </w:r>
+          </w:p>
+        </w:tc>
+        <w:tc>
+          <w:tcPr>
+            <w:tcW w:type="dxa" w:w="2664"/>
+            <w:vAlign w:val="center"/>
+          </w:tcPr>
+          <w:p>
+            <w:pPr>
+              <w:spacing w:after="40"/>
+            </w:pPr>
+            <w:r>
+              <w:rPr>
+                <w:sz w:val="18"/>
+              </w:rPr>
+              <w:t>判断用户能否完成“查询—确认—提醒”主流程；取消量作为行为描述，不直接等同失败。</w:t>
+            </w:r>
+          </w:p>
+        </w:tc>
+      </w:tr>
+      <w:tr>
+        <w:trPr>
+          <w:cantSplit/>
+        </w:trPr>
+        <w:tc>
+          <w:tcPr>
+            <w:tcW w:type="dxa" w:w="1944"/>
+            <w:vAlign w:val="center"/>
+          </w:tcPr>
+          <w:p>
+            <w:pPr>
+              <w:spacing w:after="40"/>
+            </w:pPr>
+            <w:r>
+              <w:rPr>
+                <w:sz w:val="18"/>
+              </w:rPr>
+              <w:t>邮件发送尝试结果</w:t>
+            </w:r>
+          </w:p>
+        </w:tc>
+        <w:tc>
+          <w:tcPr>
+            <w:tcW w:type="dxa" w:w="4464"/>
+            <w:vAlign w:val="center"/>
+          </w:tcPr>
+          <w:p>
+            <w:pPr>
+              <w:spacing w:after="40"/>
+            </w:pPr>
+            <w:r>
+              <w:rPr>
+                <w:sz w:val="18"/>
+              </w:rPr>
+              <w:t>逐次记录提醒邮件发送尝试及 SMTP 接受或失败结果，统计 SMTP 接受数/发送尝试数。</w:t>
+            </w:r>
+          </w:p>
+        </w:tc>
+        <w:tc>
+          <w:tcPr>
+            <w:tcW w:type="dxa" w:w="2664"/>
+            <w:vAlign w:val="center"/>
+          </w:tcPr>
+          <w:p>
+            <w:pPr>
+              <w:spacing w:after="40"/>
+            </w:pPr>
+            <w:r>
+              <w:rPr>
+                <w:sz w:val="18"/>
+              </w:rPr>
+              <w:t>观察发送链路可靠性；SMTP 接受只表示服务商接受请求，不代表邮件必然进入收件箱。</w:t>
+            </w:r>
+          </w:p>
+        </w:tc>
+      </w:tr>
+      <w:tr>
+        <w:trPr>
+          <w:cantSplit/>
+        </w:trPr>
+        <w:tc>
+          <w:tcPr>
+            <w:tcW w:type="dxa" w:w="1944"/>
+            <w:vAlign w:val="center"/>
+          </w:tcPr>
+          <w:p>
+            <w:pPr>
+              <w:spacing w:after="40"/>
+            </w:pPr>
+            <w:r>
+              <w:rPr>
+                <w:sz w:val="18"/>
+              </w:rPr>
+              <w:t>提醒生命周期正确性</w:t>
+            </w:r>
+          </w:p>
+        </w:tc>
+        <w:tc>
+          <w:tcPr>
+            <w:tcW w:type="dxa" w:w="4464"/>
+            <w:vAlign w:val="center"/>
+          </w:tcPr>
+          <w:p>
+            <w:pPr>
+              <w:spacing w:after="40"/>
+            </w:pPr>
+            <w:r>
+              <w:rPr>
+                <w:sz w:val="18"/>
+              </w:rPr>
+              <w:t>记录重复请求去重、核验后时间变更重排、取消提醒停止未发送通知的处理结果及异常。</w:t>
+            </w:r>
+          </w:p>
+        </w:tc>
+        <w:tc>
+          <w:tcPr>
+            <w:tcW w:type="dxa" w:w="2664"/>
+            <w:vAlign w:val="center"/>
+          </w:tcPr>
+          <w:p>
+            <w:pPr>
+              <w:spacing w:after="40"/>
+            </w:pPr>
+            <w:r>
+              <w:rPr>
+                <w:sz w:val="18"/>
+              </w:rPr>
+              <w:t>用于核查 D-07 规则是否按预期执行；试点基线形成后再评估量化目标。</w:t>
+            </w:r>
+          </w:p>
+        </w:tc>
+      </w:tr>
+    </w:tbl>
     <w:sectPr>
       <w:pgSz w:w="11909" w:h="16834"/>
       <w:pgMar w:top="979" w:right="1037" w:bottom="936" w:left="1037" w:header="720" w:footer="720" w:gutter="0"/>

</xml_diff>